<commit_message>
docs(audit): update AI audit log and test specifications with verified CI runs
</commit_message>
<xml_diff>
--- a/docs/audit/ci-cd-deploy-fixes_AI_Audit_Log.docx
+++ b/docs/audit/ci-cd-deploy-fixes_AI_Audit_Log.docx
@@ -1361,7 +1361,7 @@
           </w:tcPr>
           <w:p>
             <w:r>
-              <w:t>`.github/workflows/compose-smoke-test.yml`</w:t>
+              <w:t>`.github/workflows/compose-smoke-test.yml` (Run `38347551726`)</w:t>
             </w:r>
           </w:p>
         </w:tc>
@@ -1413,7 +1413,7 @@
           </w:tcPr>
           <w:p>
             <w:r>
-              <w:t>`.github/workflows/ci.yml` (Run `38343538187`)</w:t>
+              <w:t>`.github/workflows/ci.yml` (Run `38347551715`)</w:t>
             </w:r>
           </w:p>
         </w:tc>
@@ -1465,7 +1465,7 @@
           </w:tcPr>
           <w:p>
             <w:r>
-              <w:t>`.github/workflows/security.yml` (Run `38343538186`)</w:t>
+              <w:t>`.github/workflows/security.yml` (Run `38347551709`)</w:t>
             </w:r>
           </w:p>
         </w:tc>
@@ -1916,7 +1916,7 @@
           </w:tcPr>
           <w:p>
             <w:r>
-              <w:t>`9e89861`</w:t>
+              <w:t>`ee3dea7`</w:t>
             </w:r>
           </w:p>
         </w:tc>
@@ -1937,6 +1937,102 @@
           <w:p>
             <w:r>
               <w:t>docs(audit): update AI audit log and test cases for deployment review findings</w:t>
+            </w:r>
+          </w:p>
+        </w:tc>
+      </w:tr>
+      <w:tr>
+        <w:tc>
+          <w:tcPr>
+            <w:tcW w:type="dxa" w:w="2880"/>
+          </w:tcPr>
+          <w:p>
+            <w:r>
+              <w:t>`42f4475`</w:t>
+            </w:r>
+          </w:p>
+        </w:tc>
+        <w:tc>
+          <w:tcPr>
+            <w:tcW w:type="dxa" w:w="2880"/>
+          </w:tcPr>
+          <w:p>
+            <w:r>
+              <w:t>Work Item C</w:t>
+            </w:r>
+          </w:p>
+        </w:tc>
+        <w:tc>
+          <w:tcPr>
+            <w:tcW w:type="dxa" w:w="2880"/>
+          </w:tcPr>
+          <w:p>
+            <w:r>
+              <w:t>fix(ci): export job-level IMAGE_TAG for compose smoke test steps</w:t>
+            </w:r>
+          </w:p>
+        </w:tc>
+      </w:tr>
+      <w:tr>
+        <w:tc>
+          <w:tcPr>
+            <w:tcW w:type="dxa" w:w="2880"/>
+          </w:tcPr>
+          <w:p>
+            <w:r>
+              <w:t>`81ff235`</w:t>
+            </w:r>
+          </w:p>
+        </w:tc>
+        <w:tc>
+          <w:tcPr>
+            <w:tcW w:type="dxa" w:w="2880"/>
+          </w:tcPr>
+          <w:p>
+            <w:r>
+              <w:t>Work Item C</w:t>
+            </w:r>
+          </w:p>
+        </w:tc>
+        <w:tc>
+          <w:tcPr>
+            <w:tcW w:type="dxa" w:w="2880"/>
+          </w:tcPr>
+          <w:p>
+            <w:r>
+              <w:t>fix(ci): suppress row count in smoke test DB_NAME assertion query</w:t>
+            </w:r>
+          </w:p>
+        </w:tc>
+      </w:tr>
+      <w:tr>
+        <w:tc>
+          <w:tcPr>
+            <w:tcW w:type="dxa" w:w="2880"/>
+          </w:tcPr>
+          <w:p>
+            <w:r>
+              <w:t>`cc79ab5`</w:t>
+            </w:r>
+          </w:p>
+        </w:tc>
+        <w:tc>
+          <w:tcPr>
+            <w:tcW w:type="dxa" w:w="2880"/>
+          </w:tcPr>
+          <w:p>
+            <w:r>
+              <w:t>Work Item C</w:t>
+            </w:r>
+          </w:p>
+        </w:tc>
+        <w:tc>
+          <w:tcPr>
+            <w:tcW w:type="dxa" w:w="2880"/>
+          </w:tcPr>
+          <w:p>
+            <w:r>
+              <w:t>fix(ci): refine port mapping assertion and idempotency step in compose smoke test</w:t>
             </w:r>
           </w:p>
         </w:tc>

</xml_diff>

<commit_message>
docs(tests): align test case statuses with honest execution evidence
</commit_message>
<xml_diff>
--- a/docs/audit/ci-cd-deploy-fixes_AI_Audit_Log.docx
+++ b/docs/audit/ci-cd-deploy-fixes_AI_Audit_Log.docx
@@ -906,7 +906,15 @@
         <w:pStyle w:val="ListBullet"/>
       </w:pPr>
       <w:r>
-        <w:t>Created test specifications file `docs/test-specs/ci-cd-deploy-fixes_Test_Cases.md` covering all 13 required test cases (TC-DEPLOY-01 through TC-DEPLOY-13).</w:t>
+        <w:t>Maintained test specifications file `docs/tests/ci-cd-deploy-fixes_test_cases.md` according to repository convention, covering all 13 required test cases (TC-DEPLOY-01 through TC-DEPLOY-13).</w:t>
+      </w:r>
+    </w:p>
+    <w:p>
+      <w:pPr>
+        <w:pStyle w:val="ListBullet"/>
+      </w:pPr>
+      <w:r>
+        <w:t>Removed duplicate test specification file `docs/test-specs/ci-cd-deploy-fixes_Test_Cases.md` to conform to repository standards.</w:t>
       </w:r>
     </w:p>
     <w:p>
@@ -931,6 +939,126 @@
       </w:pPr>
       <w:r>
         <w:t>Updated PR #36 description with accurate issue counts, work items, and checklist mappings.</w:t>
+      </w:r>
+    </w:p>
+    <w:p>
+      <w:pPr>
+        <w:pStyle w:val="Heading3"/>
+      </w:pPr>
+      <w:r>
+        <w:t>Follow-Up Work Items (Round 2 Review Findings)</w:t>
+      </w:r>
+    </w:p>
+    <w:p>
+      <w:pPr>
+        <w:pStyle w:val="ListBullet"/>
+      </w:pPr>
+      <w:r>
+        <w:t>**Follow-Up 1 &amp; 2 (Honest Test Case Statuses &amp; Convention Alignment)**:</w:t>
+      </w:r>
+    </w:p>
+    <w:p>
+      <w:pPr>
+        <w:pStyle w:val="ListBullet"/>
+      </w:pPr>
+      <w:r>
+        <w:t>Reviewed every test case status honestly: marked "PASSED (CI)" only for checks executed and asserted in CI workflows, "PASSED (static check only)" for docker compose config interpolation, and "NOT RUN" with explicit technical reasons for the remainder.</w:t>
+      </w:r>
+    </w:p>
+    <w:p>
+      <w:pPr>
+        <w:pStyle w:val="ListBullet"/>
+      </w:pPr>
+      <w:r>
+        <w:t>Deleted duplicate file `docs/test-specs/ci-cd-deploy-fixes_Test_Cases.md`, retaining `docs/tests/ci-cd-deploy-fixes_test_cases.md` matching repository conventions.</w:t>
+      </w:r>
+    </w:p>
+    <w:p>
+      <w:pPr>
+        <w:pStyle w:val="ListBullet"/>
+      </w:pPr>
+      <w:r>
+        <w:t>**Follow-Up 3 (Extended Compose Smoke Test)**:</w:t>
+      </w:r>
+    </w:p>
+    <w:p>
+      <w:pPr>
+        <w:pStyle w:val="ListBullet"/>
+      </w:pPr>
+      <w:r>
+        <w:t>Extended `.github/workflows/compose-smoke-test.yml` to build the backend container image (`IMAGE_TAG=ci`), start the `with-db` stack, poll `/actuator/health` until reporting `UP`, and assert Flyway migrations were applied against database `sportify`.</w:t>
+      </w:r>
+    </w:p>
+    <w:p>
+      <w:pPr>
+        <w:pStyle w:val="ListBullet"/>
+      </w:pPr>
+      <w:r>
+        <w:t>Added negative checks: asserting that non-sa `DB_USERNAME` causes backend connection failure and that weak password policy violation makes `sqlserver` exit.</w:t>
+      </w:r>
+    </w:p>
+    <w:p>
+      <w:pPr>
+        <w:pStyle w:val="ListBullet"/>
+      </w:pPr>
+      <w:r>
+        <w:t>**Follow-Up 4 (Pinned SQL Server CU Tag and Weekly Schedule)**:</w:t>
+      </w:r>
+    </w:p>
+    <w:p>
+      <w:pPr>
+        <w:pStyle w:val="ListBullet"/>
+      </w:pPr>
+      <w:r>
+        <w:t>Pinned `mcr.microsoft.com/mssql/server:2022-CU27-ubuntu-22.04` in `deploy/compose.yaml` (both `sqlserver` and `db-init` services).</w:t>
+      </w:r>
+    </w:p>
+    <w:p>
+      <w:pPr>
+        <w:pStyle w:val="ListBullet"/>
+      </w:pPr>
+      <w:r>
+        <w:t>Added weekly cron schedule (`0 0 * * 0`) to `.github/workflows/compose-smoke-test.yml` and documented in `docs/ci-cd.md`.</w:t>
+      </w:r>
+    </w:p>
+    <w:p>
+      <w:pPr>
+        <w:pStyle w:val="ListBullet"/>
+      </w:pPr>
+      <w:r>
+        <w:t>**Follow-Up 5 (Grep Stale Container Names)**:</w:t>
+      </w:r>
+    </w:p>
+    <w:p>
+      <w:pPr>
+        <w:pStyle w:val="ListBullet"/>
+      </w:pPr>
+      <w:r>
+        <w:t>Grepped `.github/` and `docs/` for `sportify-backend`, `sportify-sqlserver`, `sportify-db-init`, and `sportify-network`. Confirmed 0 stale occurrences exist.</w:t>
+      </w:r>
+    </w:p>
+    <w:p>
+      <w:pPr>
+        <w:pStyle w:val="ListBullet"/>
+      </w:pPr>
+      <w:r>
+        <w:t>**Follow-Up 6 (Proof of Port 1433 Negative Test Assertion)**:</w:t>
+      </w:r>
+    </w:p>
+    <w:p>
+      <w:pPr>
+        <w:pStyle w:val="ListBullet"/>
+      </w:pPr>
+      <w:r>
+        <w:t>Verified diffs of commits `81ff235` and `cc79ab5`.</w:t>
+      </w:r>
+    </w:p>
+    <w:p>
+      <w:pPr>
+        <w:pStyle w:val="ListBullet"/>
+      </w:pPr>
+      <w:r>
+        <w:t>Proved the port 1433 check fails when published by temporarily mapping `1433:1433` (Run `38349858419` failed with `Error: Port 1433 is mapped to host port: 14331433`), then reverted via commit `92aef11`.</w:t>
       </w:r>
     </w:p>
     <w:p>
@@ -1163,7 +1291,7 @@
           </w:tcPr>
           <w:p>
             <w:r>
-              <w:t>PASSED</w:t>
+              <w:t>PASSED (static check only)</w:t>
             </w:r>
           </w:p>
         </w:tc>
@@ -1215,7 +1343,7 @@
           </w:tcPr>
           <w:p>
             <w:r>
-              <w:t>PASSED</w:t>
+              <w:t>PASSED (static check only)</w:t>
             </w:r>
           </w:p>
         </w:tc>
@@ -1267,7 +1395,7 @@
           </w:tcPr>
           <w:p>
             <w:r>
-              <w:t>PASSED</w:t>
+              <w:t>PASSED (static check only)</w:t>
             </w:r>
           </w:p>
         </w:tc>
@@ -1319,7 +1447,7 @@
           </w:tcPr>
           <w:p>
             <w:r>
-              <w:t>PASSED</w:t>
+              <w:t>PASSED (CI)</w:t>
             </w:r>
           </w:p>
         </w:tc>
@@ -1341,7 +1469,7 @@
           </w:tcPr>
           <w:p>
             <w:r>
-              <w:t>Compose Smoke Test</w:t>
+              <w:t>Healthcheck Path</w:t>
             </w:r>
           </w:p>
         </w:tc>
@@ -1351,7 +1479,7 @@
           </w:tcPr>
           <w:p>
             <w:r>
-              <w:t>Full container provisioning in CI</w:t>
+              <w:t>SQL Server 2022 healthcheck healthy</w:t>
             </w:r>
           </w:p>
         </w:tc>
@@ -1361,7 +1489,7 @@
           </w:tcPr>
           <w:p>
             <w:r>
-              <w:t>`.github/workflows/compose-smoke-test.yml` (Run `38347551726`)</w:t>
+              <w:t>`.github/workflows/compose-smoke-test.yml`</w:t>
             </w:r>
           </w:p>
         </w:tc>
@@ -1371,7 +1499,7 @@
           </w:tcPr>
           <w:p>
             <w:r>
-              <w:t>PASSED</w:t>
+              <w:t>PASSED (CI)</w:t>
             </w:r>
           </w:p>
         </w:tc>
@@ -1381,7 +1509,319 @@
           </w:tcPr>
           <w:p>
             <w:r>
-              <w:t>Healthcheck, db-init, sa login, idempotency, port isolation verified in GitHub Actions runner.</w:t>
+              <w:t>Pinned tools18 path with `-C -b` succeeds.</w:t>
+            </w:r>
+          </w:p>
+        </w:tc>
+      </w:tr>
+      <w:tr>
+        <w:tc>
+          <w:tcPr>
+            <w:tcW w:type="dxa" w:w="1728"/>
+          </w:tcPr>
+          <w:p>
+            <w:r>
+              <w:t>db-init &amp; Idempotency</w:t>
+            </w:r>
+          </w:p>
+        </w:tc>
+        <w:tc>
+          <w:tcPr>
+            <w:tcW w:type="dxa" w:w="1728"/>
+          </w:tcPr>
+          <w:p>
+            <w:r>
+              <w:t>DB creation and idempotent rerun</w:t>
+            </w:r>
+          </w:p>
+        </w:tc>
+        <w:tc>
+          <w:tcPr>
+            <w:tcW w:type="dxa" w:w="1728"/>
+          </w:tcPr>
+          <w:p>
+            <w:r>
+              <w:t>`.github/workflows/compose-smoke-test.yml`</w:t>
+            </w:r>
+          </w:p>
+        </w:tc>
+        <w:tc>
+          <w:tcPr>
+            <w:tcW w:type="dxa" w:w="1728"/>
+          </w:tcPr>
+          <w:p>
+            <w:r>
+              <w:t>PASSED (CI)</w:t>
+            </w:r>
+          </w:p>
+        </w:tc>
+        <w:tc>
+          <w:tcPr>
+            <w:tcW w:type="dxa" w:w="1728"/>
+          </w:tcPr>
+          <w:p>
+            <w:r>
+              <w:t>`IF DB_ID(N'sportify') IS NULL` creates database; rerun exits 0.</w:t>
+            </w:r>
+          </w:p>
+        </w:tc>
+      </w:tr>
+      <w:tr>
+        <w:tc>
+          <w:tcPr>
+            <w:tcW w:type="dxa" w:w="1728"/>
+          </w:tcPr>
+          <w:p>
+            <w:r>
+              <w:t>sa Authentication</w:t>
+            </w:r>
+          </w:p>
+        </w:tc>
+        <w:tc>
+          <w:tcPr>
+            <w:tcW w:type="dxa" w:w="1728"/>
+          </w:tcPr>
+          <w:p>
+            <w:r>
+              <w:t>sa login against database sportify</w:t>
+            </w:r>
+          </w:p>
+        </w:tc>
+        <w:tc>
+          <w:tcPr>
+            <w:tcW w:type="dxa" w:w="1728"/>
+          </w:tcPr>
+          <w:p>
+            <w:r>
+              <w:t>`.github/workflows/compose-smoke-test.yml`</w:t>
+            </w:r>
+          </w:p>
+        </w:tc>
+        <w:tc>
+          <w:tcPr>
+            <w:tcW w:type="dxa" w:w="1728"/>
+          </w:tcPr>
+          <w:p>
+            <w:r>
+              <w:t>PASSED (CI)</w:t>
+            </w:r>
+          </w:p>
+        </w:tc>
+        <w:tc>
+          <w:tcPr>
+            <w:tcW w:type="dxa" w:w="1728"/>
+          </w:tcPr>
+          <w:p>
+            <w:r>
+              <w:t>`SELECT DB_NAME()` returns `sportify`.</w:t>
+            </w:r>
+          </w:p>
+        </w:tc>
+      </w:tr>
+      <w:tr>
+        <w:tc>
+          <w:tcPr>
+            <w:tcW w:type="dxa" w:w="1728"/>
+          </w:tcPr>
+          <w:p>
+            <w:r>
+              <w:t>Port 1433 Isolation</w:t>
+            </w:r>
+          </w:p>
+        </w:tc>
+        <w:tc>
+          <w:tcPr>
+            <w:tcW w:type="dxa" w:w="1728"/>
+          </w:tcPr>
+          <w:p>
+            <w:r>
+              <w:t>Port 1433 unmapped from host</w:t>
+            </w:r>
+          </w:p>
+        </w:tc>
+        <w:tc>
+          <w:tcPr>
+            <w:tcW w:type="dxa" w:w="1728"/>
+          </w:tcPr>
+          <w:p>
+            <w:r>
+              <w:t>`.github/workflows/compose-smoke-test.yml`</w:t>
+            </w:r>
+          </w:p>
+        </w:tc>
+        <w:tc>
+          <w:tcPr>
+            <w:tcW w:type="dxa" w:w="1728"/>
+          </w:tcPr>
+          <w:p>
+            <w:r>
+              <w:t>PASSED (CI)</w:t>
+            </w:r>
+          </w:p>
+        </w:tc>
+        <w:tc>
+          <w:tcPr>
+            <w:tcW w:type="dxa" w:w="1728"/>
+          </w:tcPr>
+          <w:p>
+            <w:r>
+              <w:t>Verified unmapped; negative test run 38349858419 failed when published.</w:t>
+            </w:r>
+          </w:p>
+        </w:tc>
+      </w:tr>
+      <w:tr>
+        <w:tc>
+          <w:tcPr>
+            <w:tcW w:type="dxa" w:w="1728"/>
+          </w:tcPr>
+          <w:p>
+            <w:r>
+              <w:t>Non-sa Rejection</w:t>
+            </w:r>
+          </w:p>
+        </w:tc>
+        <w:tc>
+          <w:tcPr>
+            <w:tcW w:type="dxa" w:w="1728"/>
+          </w:tcPr>
+          <w:p>
+            <w:r>
+              <w:t>Non-sa DB_USERNAME rejected</w:t>
+            </w:r>
+          </w:p>
+        </w:tc>
+        <w:tc>
+          <w:tcPr>
+            <w:tcW w:type="dxa" w:w="1728"/>
+          </w:tcPr>
+          <w:p>
+            <w:r>
+              <w:t>`.github/workflows/compose-smoke-test.yml`</w:t>
+            </w:r>
+          </w:p>
+        </w:tc>
+        <w:tc>
+          <w:tcPr>
+            <w:tcW w:type="dxa" w:w="1728"/>
+          </w:tcPr>
+          <w:p>
+            <w:r>
+              <w:t>PASSED (CI)</w:t>
+            </w:r>
+          </w:p>
+        </w:tc>
+        <w:tc>
+          <w:tcPr>
+            <w:tcW w:type="dxa" w:w="1728"/>
+          </w:tcPr>
+          <w:p>
+            <w:r>
+              <w:t>Backend fails startup on invalid database user.</w:t>
+            </w:r>
+          </w:p>
+        </w:tc>
+      </w:tr>
+      <w:tr>
+        <w:tc>
+          <w:tcPr>
+            <w:tcW w:type="dxa" w:w="1728"/>
+          </w:tcPr>
+          <w:p>
+            <w:r>
+              <w:t>Password Policy</w:t>
+            </w:r>
+          </w:p>
+        </w:tc>
+        <w:tc>
+          <w:tcPr>
+            <w:tcW w:type="dxa" w:w="1728"/>
+          </w:tcPr>
+          <w:p>
+            <w:r>
+              <w:t>Weak password causes sqlserver exit</w:t>
+            </w:r>
+          </w:p>
+        </w:tc>
+        <w:tc>
+          <w:tcPr>
+            <w:tcW w:type="dxa" w:w="1728"/>
+          </w:tcPr>
+          <w:p>
+            <w:r>
+              <w:t>`.github/workflows/compose-smoke-test.yml`</w:t>
+            </w:r>
+          </w:p>
+        </w:tc>
+        <w:tc>
+          <w:tcPr>
+            <w:tcW w:type="dxa" w:w="1728"/>
+          </w:tcPr>
+          <w:p>
+            <w:r>
+              <w:t>PASSED (CI)</w:t>
+            </w:r>
+          </w:p>
+        </w:tc>
+        <w:tc>
+          <w:tcPr>
+            <w:tcW w:type="dxa" w:w="1728"/>
+          </w:tcPr>
+          <w:p>
+            <w:r>
+              <w:t>Container terminates immediately on policy violation.</w:t>
+            </w:r>
+          </w:p>
+        </w:tc>
+      </w:tr>
+      <w:tr>
+        <w:tc>
+          <w:tcPr>
+            <w:tcW w:type="dxa" w:w="1728"/>
+          </w:tcPr>
+          <w:p>
+            <w:r>
+              <w:t>Backend &amp; Flyway</w:t>
+            </w:r>
+          </w:p>
+        </w:tc>
+        <w:tc>
+          <w:tcPr>
+            <w:tcW w:type="dxa" w:w="1728"/>
+          </w:tcPr>
+          <w:p>
+            <w:r>
+              <w:t>Actuator health UP and migrations applied</w:t>
+            </w:r>
+          </w:p>
+        </w:tc>
+        <w:tc>
+          <w:tcPr>
+            <w:tcW w:type="dxa" w:w="1728"/>
+          </w:tcPr>
+          <w:p>
+            <w:r>
+              <w:t>`.github/workflows/compose-smoke-test.yml`</w:t>
+            </w:r>
+          </w:p>
+        </w:tc>
+        <w:tc>
+          <w:tcPr>
+            <w:tcW w:type="dxa" w:w="1728"/>
+          </w:tcPr>
+          <w:p>
+            <w:r>
+              <w:t>PASSED (CI)</w:t>
+            </w:r>
+          </w:p>
+        </w:tc>
+        <w:tc>
+          <w:tcPr>
+            <w:tcW w:type="dxa" w:w="1728"/>
+          </w:tcPr>
+          <w:p>
+            <w:r>
+              <w:t>`/actuator/health` reports UP; 19 Flyway migrations applied.</w:t>
             </w:r>
           </w:p>
         </w:tc>
@@ -1413,7 +1853,7 @@
           </w:tcPr>
           <w:p>
             <w:r>
-              <w:t>`.github/workflows/ci.yml` (Run `38347551715`)</w:t>
+              <w:t>`.github/workflows/ci.yml`</w:t>
             </w:r>
           </w:p>
         </w:tc>
@@ -1423,7 +1863,7 @@
           </w:tcPr>
           <w:p>
             <w:r>
-              <w:t>PASSED</w:t>
+              <w:t>PASSED (CI)</w:t>
             </w:r>
           </w:p>
         </w:tc>
@@ -1465,7 +1905,7 @@
           </w:tcPr>
           <w:p>
             <w:r>
-              <w:t>`.github/workflows/security.yml` (Run `38347551709`)</w:t>
+              <w:t>`.github/workflows/security.yml`</w:t>
             </w:r>
           </w:p>
         </w:tc>
@@ -1475,7 +1915,7 @@
           </w:tcPr>
           <w:p>
             <w:r>
-              <w:t>PASSED</w:t>
+              <w:t>PASSED (CI)</w:t>
             </w:r>
           </w:p>
         </w:tc>
@@ -1622,6 +2062,78 @@
       </w:pPr>
       <w:r>
         <w:t>Reason: In accordance with project conventions, containers are not started in the local Windows environment. Runtime container execution was verified in GitHub Actions runners via `.github/workflows/compose-smoke-test.yml` and Testcontainers.</w:t>
+      </w:r>
+    </w:p>
+    <w:p>
+      <w:pPr>
+        <w:pStyle w:val="ListNumber"/>
+      </w:pPr>
+      <w:r>
+        <w:t>**CD Workflow Execution on Tag Push vs Dispatch (TC-DEPLOY-01, TC-DEPLOY-02)**:</w:t>
+      </w:r>
+    </w:p>
+    <w:p>
+      <w:pPr>
+        <w:pStyle w:val="ListBullet"/>
+      </w:pPr>
+      <w:r>
+        <w:t>Status: **NOT RUN**.</w:t>
+      </w:r>
+    </w:p>
+    <w:p>
+      <w:pPr>
+        <w:pStyle w:val="ListBullet"/>
+      </w:pPr>
+      <w:r>
+        <w:t>Reason: Workflow `cd.yml` only runs on semver tag push or manual workflow dispatch, not on PR pull requests.</w:t>
+      </w:r>
+    </w:p>
+    <w:p>
+      <w:pPr>
+        <w:pStyle w:val="ListNumber"/>
+      </w:pPr>
+      <w:r>
+        <w:t>**Fail-Fast on Unedited Placeholders (TC-DEPLOY-12)**:</w:t>
+      </w:r>
+    </w:p>
+    <w:p>
+      <w:pPr>
+        <w:pStyle w:val="ListBullet"/>
+      </w:pPr>
+      <w:r>
+        <w:t>Status: **NOT RUN**.</w:t>
+      </w:r>
+    </w:p>
+    <w:p>
+      <w:pPr>
+        <w:pStyle w:val="ListBullet"/>
+      </w:pPr>
+      <w:r>
+        <w:t>Reason: Verified through code analysis of base64 decoding logic, not run as a dedicated CI test job.</w:t>
+      </w:r>
+    </w:p>
+    <w:p>
+      <w:pPr>
+        <w:pStyle w:val="ListNumber"/>
+      </w:pPr>
+      <w:r>
+        <w:t>**Deployment Rollback Script Execution (TC-DEPLOY-13)**:</w:t>
+      </w:r>
+    </w:p>
+    <w:p>
+      <w:pPr>
+        <w:pStyle w:val="ListBullet"/>
+      </w:pPr>
+      <w:r>
+        <w:t>Status: **NOT RUN**.</w:t>
+      </w:r>
+    </w:p>
+    <w:p>
+      <w:pPr>
+        <w:pStyle w:val="ListBullet"/>
+      </w:pPr>
+      <w:r>
+        <w:t>Reason: Rollback script in `.github/actions/deploy-compose` only executes during live SSH deployment in `cd.yml`.</w:t>
       </w:r>
     </w:p>
     <w:p>
@@ -2037,6 +2549,198 @@
           </w:p>
         </w:tc>
       </w:tr>
+      <w:tr>
+        <w:tc>
+          <w:tcPr>
+            <w:tcW w:type="dxa" w:w="2880"/>
+          </w:tcPr>
+          <w:p>
+            <w:r>
+              <w:t>`819b840`</w:t>
+            </w:r>
+          </w:p>
+        </w:tc>
+        <w:tc>
+          <w:tcPr>
+            <w:tcW w:type="dxa" w:w="2880"/>
+          </w:tcPr>
+          <w:p>
+            <w:r>
+              <w:t>Work Item D</w:t>
+            </w:r>
+          </w:p>
+        </w:tc>
+        <w:tc>
+          <w:tcPr>
+            <w:tcW w:type="dxa" w:w="2880"/>
+          </w:tcPr>
+          <w:p>
+            <w:r>
+              <w:t>docs(audit): update AI audit log and test specifications with verified CI runs</w:t>
+            </w:r>
+          </w:p>
+        </w:tc>
+      </w:tr>
+      <w:tr>
+        <w:tc>
+          <w:tcPr>
+            <w:tcW w:type="dxa" w:w="2880"/>
+          </w:tcPr>
+          <w:p>
+            <w:r>
+              <w:t>`98d0668`</w:t>
+            </w:r>
+          </w:p>
+        </w:tc>
+        <w:tc>
+          <w:tcPr>
+            <w:tcW w:type="dxa" w:w="2880"/>
+          </w:tcPr>
+          <w:p>
+            <w:r>
+              <w:t>Follow-Up 6</w:t>
+            </w:r>
+          </w:p>
+        </w:tc>
+        <w:tc>
+          <w:tcPr>
+            <w:tcW w:type="dxa" w:w="2880"/>
+          </w:tcPr>
+          <w:p>
+            <w:r>
+              <w:t>test(deploy): temporarily publish port 1433 to prove negative port check fails</w:t>
+            </w:r>
+          </w:p>
+        </w:tc>
+      </w:tr>
+      <w:tr>
+        <w:tc>
+          <w:tcPr>
+            <w:tcW w:type="dxa" w:w="2880"/>
+          </w:tcPr>
+          <w:p>
+            <w:r>
+              <w:t>`92aef11`</w:t>
+            </w:r>
+          </w:p>
+        </w:tc>
+        <w:tc>
+          <w:tcPr>
+            <w:tcW w:type="dxa" w:w="2880"/>
+          </w:tcPr>
+          <w:p>
+            <w:r>
+              <w:t>Follow-Up 6</w:t>
+            </w:r>
+          </w:p>
+        </w:tc>
+        <w:tc>
+          <w:tcPr>
+            <w:tcW w:type="dxa" w:w="2880"/>
+          </w:tcPr>
+          <w:p>
+            <w:r>
+              <w:t>Revert "test(deploy): temporarily publish port 1433 to prove negative port check fails"</w:t>
+            </w:r>
+          </w:p>
+        </w:tc>
+      </w:tr>
+      <w:tr>
+        <w:tc>
+          <w:tcPr>
+            <w:tcW w:type="dxa" w:w="2880"/>
+          </w:tcPr>
+          <w:p>
+            <w:r>
+              <w:t>`2f07b3c`</w:t>
+            </w:r>
+          </w:p>
+        </w:tc>
+        <w:tc>
+          <w:tcPr>
+            <w:tcW w:type="dxa" w:w="2880"/>
+          </w:tcPr>
+          <w:p>
+            <w:r>
+              <w:t>Follow-Up 2</w:t>
+            </w:r>
+          </w:p>
+        </w:tc>
+        <w:tc>
+          <w:tcPr>
+            <w:tcW w:type="dxa" w:w="2880"/>
+          </w:tcPr>
+          <w:p>
+            <w:r>
+              <w:t>refactor(tests): remove duplicate test case file in favor of standard repository convention</w:t>
+            </w:r>
+          </w:p>
+        </w:tc>
+      </w:tr>
+      <w:tr>
+        <w:tc>
+          <w:tcPr>
+            <w:tcW w:type="dxa" w:w="2880"/>
+          </w:tcPr>
+          <w:p>
+            <w:r>
+              <w:t>`b8ff946`</w:t>
+            </w:r>
+          </w:p>
+        </w:tc>
+        <w:tc>
+          <w:tcPr>
+            <w:tcW w:type="dxa" w:w="2880"/>
+          </w:tcPr>
+          <w:p>
+            <w:r>
+              <w:t>Follow-Up 4</w:t>
+            </w:r>
+          </w:p>
+        </w:tc>
+        <w:tc>
+          <w:tcPr>
+            <w:tcW w:type="dxa" w:w="2880"/>
+          </w:tcPr>
+          <w:p>
+            <w:r>
+              <w:t>feat(ci): pin mssql server image to 2022-CU27-ubuntu-22.04 in compose template</w:t>
+            </w:r>
+          </w:p>
+        </w:tc>
+      </w:tr>
+      <w:tr>
+        <w:tc>
+          <w:tcPr>
+            <w:tcW w:type="dxa" w:w="2880"/>
+          </w:tcPr>
+          <w:p>
+            <w:r>
+              <w:t>`a674a42`</w:t>
+            </w:r>
+          </w:p>
+        </w:tc>
+        <w:tc>
+          <w:tcPr>
+            <w:tcW w:type="dxa" w:w="2880"/>
+          </w:tcPr>
+          <w:p>
+            <w:r>
+              <w:t>Follow-Up 3</w:t>
+            </w:r>
+          </w:p>
+        </w:tc>
+        <w:tc>
+          <w:tcPr>
+            <w:tcW w:type="dxa" w:w="2880"/>
+          </w:tcPr>
+          <w:p>
+            <w:r>
+              <w:t>ci(deploy): extend compose smoke test with backend build, actuator health, and negative checks</w:t>
+            </w:r>
+          </w:p>
+        </w:tc>
+      </w:tr>
     </w:tbl>
     <w:p/>
     <w:sectPr>

</xml_diff>

<commit_message>
docs(tests): document TC-DEPLOY-01 and TC-DEPLOY-02 reviewer dispatch steps and audit log
</commit_message>
<xml_diff>
--- a/docs/audit/ci-cd-deploy-fixes_AI_Audit_Log.docx
+++ b/docs/audit/ci-cd-deploy-fixes_AI_Audit_Log.docx
@@ -1059,6 +1059,62 @@
       </w:pPr>
       <w:r>
         <w:t>Proved the port 1433 check fails when published by temporarily mapping `1433:1433` (Run `38349858419` failed with `Error: Port 1433 is mapped to host port: 14331433`), then reverted via commit `92aef11`.</w:t>
+      </w:r>
+    </w:p>
+    <w:p>
+      <w:pPr>
+        <w:pStyle w:val="ListBullet"/>
+      </w:pPr>
+      <w:r>
+        <w:t>**Follow-Up 7 (Dynamic Migrations, Failure Log Proofs, Path Filters, and Fail-Fast JWT CI Check)**:</w:t>
+      </w:r>
+    </w:p>
+    <w:p>
+      <w:pPr>
+        <w:pStyle w:val="ListBullet"/>
+      </w:pPr>
+      <w:r>
+        <w:t>Dynamically counted migration files in `.github/workflows/compose-smoke-test.yml` using `find backend/src/main/resources/db/migration -type f -name 'V*.sql'`, replacing the hardcoded 19-count assertion. Asserted both total rows and `success = 1` rows equal the dynamic count.</w:t>
+      </w:r>
+    </w:p>
+    <w:p>
+      <w:pPr>
+        <w:pStyle w:val="ListBullet"/>
+      </w:pPr>
+      <w:r>
+        <w:t>Made negative checks prove failure reasons by capturing output and asserting specific log strings: grepped backend logs for `Login failed for user 'nonexistent_user'`, and grepped sqlserver logs for `password policy`. Steps fail if expected messages are absent.</w:t>
+      </w:r>
+    </w:p>
+    <w:p>
+      <w:pPr>
+        <w:pStyle w:val="ListBullet"/>
+      </w:pPr>
+      <w:r>
+        <w:t>Added `backend/Dockerfile` and `backend/src/main/resources/**` to `compose-smoke-test.yml` PR and push path filters, and updated `docs/ci-cd.md`.</w:t>
+      </w:r>
+    </w:p>
+    <w:p>
+      <w:pPr>
+        <w:pStyle w:val="ListBullet"/>
+      </w:pPr>
+      <w:r>
+        <w:t>Added eager validation in `JwtService` via `@PostConstruct` calling `getSignInKey()`, ensuring fail-fast startup behavior when `JWT_SECRET` is invalid or unedited. Added unit tests in `JwtServiceTest`.</w:t>
+      </w:r>
+    </w:p>
+    <w:p>
+      <w:pPr>
+        <w:pStyle w:val="ListBullet"/>
+      </w:pPr>
+      <w:r>
+        <w:t>Added automated CI check for TC-DEPLOY-12 in `compose-smoke-test.yml`: running the backend container against a healthy database with the unedited placeholder `&lt;REPLACE_WITH_BASE64_SECRET_MIN_32_BYTES&gt;` and asserting startup failure with JWT decoding error.</w:t>
+      </w:r>
+    </w:p>
+    <w:p>
+      <w:pPr>
+        <w:pStyle w:val="ListBullet"/>
+      </w:pPr>
+      <w:r>
+        <w:t>Documented that TC-DEPLOY-01 and TC-DEPLOY-02 are NOT RUN on PR #36 and provided exact reviewer steps to trigger `cd.yml` via `workflow_dispatch` (with `DEPLOY_ENABLED` unset) before or right after merge.</w:t>
       </w:r>
     </w:p>
     <w:p>
@@ -1687,7 +1743,7 @@
           </w:tcPr>
           <w:p>
             <w:r>
-              <w:t>Non-sa DB_USERNAME rejected</w:t>
+              <w:t>Non-sa DB_USERNAME rejected with login error</w:t>
             </w:r>
           </w:p>
         </w:tc>
@@ -1717,7 +1773,7 @@
           </w:tcPr>
           <w:p>
             <w:r>
-              <w:t>Backend fails startup on invalid database user.</w:t>
+              <w:t>Backend fails startup; logs contain `Login failed for user 'nonexistent_user'`.</w:t>
             </w:r>
           </w:p>
         </w:tc>
@@ -1739,7 +1795,7 @@
           </w:tcPr>
           <w:p>
             <w:r>
-              <w:t>Weak password causes sqlserver exit</w:t>
+              <w:t>Weak password rejected with policy error</w:t>
             </w:r>
           </w:p>
         </w:tc>
@@ -1769,7 +1825,7 @@
           </w:tcPr>
           <w:p>
             <w:r>
-              <w:t>Container terminates immediately on policy violation.</w:t>
+              <w:t>Container terminates immediately; logs contain `password policy`.</w:t>
             </w:r>
           </w:p>
         </w:tc>
@@ -1781,7 +1837,7 @@
           </w:tcPr>
           <w:p>
             <w:r>
-              <w:t>Backend &amp; Flyway</w:t>
+              <w:t>Fail-Fast JWT Secret</w:t>
             </w:r>
           </w:p>
         </w:tc>
@@ -1791,7 +1847,7 @@
           </w:tcPr>
           <w:p>
             <w:r>
-              <w:t>Actuator health UP and migrations applied</w:t>
+              <w:t>Default placeholder causes startup failure (TC-DEPLOY-12)</w:t>
             </w:r>
           </w:p>
         </w:tc>
@@ -1821,7 +1877,59 @@
           </w:tcPr>
           <w:p>
             <w:r>
-              <w:t>`/actuator/health` reports UP; 19 Flyway migrations applied.</w:t>
+              <w:t>Eager `@PostConstruct` throws `DecodingException`; container exits with code 1.</w:t>
+            </w:r>
+          </w:p>
+        </w:tc>
+      </w:tr>
+      <w:tr>
+        <w:tc>
+          <w:tcPr>
+            <w:tcW w:type="dxa" w:w="1728"/>
+          </w:tcPr>
+          <w:p>
+            <w:r>
+              <w:t>Backend &amp; Flyway</w:t>
+            </w:r>
+          </w:p>
+        </w:tc>
+        <w:tc>
+          <w:tcPr>
+            <w:tcW w:type="dxa" w:w="1728"/>
+          </w:tcPr>
+          <w:p>
+            <w:r>
+              <w:t>Actuator health UP and dynamic migrations</w:t>
+            </w:r>
+          </w:p>
+        </w:tc>
+        <w:tc>
+          <w:tcPr>
+            <w:tcW w:type="dxa" w:w="1728"/>
+          </w:tcPr>
+          <w:p>
+            <w:r>
+              <w:t>`.github/workflows/compose-smoke-test.yml`</w:t>
+            </w:r>
+          </w:p>
+        </w:tc>
+        <w:tc>
+          <w:tcPr>
+            <w:tcW w:type="dxa" w:w="1728"/>
+          </w:tcPr>
+          <w:p>
+            <w:r>
+              <w:t>PASSED (CI)</w:t>
+            </w:r>
+          </w:p>
+        </w:tc>
+        <w:tc>
+          <w:tcPr>
+            <w:tcW w:type="dxa" w:w="1728"/>
+          </w:tcPr>
+          <w:p>
+            <w:r>
+              <w:t>`/actuator/health` UP; dynamic migration file count matches `flyway_schema_history`.</w:t>
             </w:r>
           </w:p>
         </w:tc>
@@ -2077,7 +2185,7 @@
         <w:pStyle w:val="ListBullet"/>
       </w:pPr>
       <w:r>
-        <w:t>Status: **NOT RUN**.</w:t>
+        <w:t>Status: **NOT RUN in PR #36**.</w:t>
       </w:r>
     </w:p>
     <w:p>
@@ -2085,31 +2193,7 @@
         <w:pStyle w:val="ListBullet"/>
       </w:pPr>
       <w:r>
-        <w:t>Reason: Workflow `cd.yml` only runs on semver tag push or manual workflow dispatch, not on PR pull requests.</w:t>
-      </w:r>
-    </w:p>
-    <w:p>
-      <w:pPr>
-        <w:pStyle w:val="ListNumber"/>
-      </w:pPr>
-      <w:r>
-        <w:t>**Fail-Fast on Unedited Placeholders (TC-DEPLOY-12)**:</w:t>
-      </w:r>
-    </w:p>
-    <w:p>
-      <w:pPr>
-        <w:pStyle w:val="ListBullet"/>
-      </w:pPr>
-      <w:r>
-        <w:t>Status: **NOT RUN**.</w:t>
-      </w:r>
-    </w:p>
-    <w:p>
-      <w:pPr>
-        <w:pStyle w:val="ListBullet"/>
-      </w:pPr>
-      <w:r>
-        <w:t>Reason: Verified through code analysis of base64 decoding logic, not run as a dedicated CI test job.</w:t>
+        <w:t>Reason: Workflow `cd.yml` only runs on semver tag push or manual workflow dispatch. To be verified by the reviewer via manual `workflow_dispatch` run of `cd.yml` (with `DEPLOY_ENABLED` unset) before or right after merge.</w:t>
       </w:r>
     </w:p>
     <w:p>
@@ -2741,6 +2825,166 @@
           </w:p>
         </w:tc>
       </w:tr>
+      <w:tr>
+        <w:tc>
+          <w:tcPr>
+            <w:tcW w:type="dxa" w:w="2880"/>
+          </w:tcPr>
+          <w:p>
+            <w:r>
+              <w:t>`f87ae83`</w:t>
+            </w:r>
+          </w:p>
+        </w:tc>
+        <w:tc>
+          <w:tcPr>
+            <w:tcW w:type="dxa" w:w="2880"/>
+          </w:tcPr>
+          <w:p>
+            <w:r>
+              <w:t>Follow-Up 1</w:t>
+            </w:r>
+          </w:p>
+        </w:tc>
+        <w:tc>
+          <w:tcPr>
+            <w:tcW w:type="dxa" w:w="2880"/>
+          </w:tcPr>
+          <w:p>
+            <w:r>
+              <w:t>docs(tests): align test case statuses with honest execution evidence</w:t>
+            </w:r>
+          </w:p>
+        </w:tc>
+      </w:tr>
+      <w:tr>
+        <w:tc>
+          <w:tcPr>
+            <w:tcW w:type="dxa" w:w="2880"/>
+          </w:tcPr>
+          <w:p>
+            <w:r>
+              <w:t>`d49e92d`</w:t>
+            </w:r>
+          </w:p>
+        </w:tc>
+        <w:tc>
+          <w:tcPr>
+            <w:tcW w:type="dxa" w:w="2880"/>
+          </w:tcPr>
+          <w:p>
+            <w:r>
+              <w:t>Follow-Up 7 (Item 1)</w:t>
+            </w:r>
+          </w:p>
+        </w:tc>
+        <w:tc>
+          <w:tcPr>
+            <w:tcW w:type="dxa" w:w="2880"/>
+          </w:tcPr>
+          <w:p>
+            <w:r>
+              <w:t>ci(deploy): assert dynamic migration file count in compose smoke test</w:t>
+            </w:r>
+          </w:p>
+        </w:tc>
+      </w:tr>
+      <w:tr>
+        <w:tc>
+          <w:tcPr>
+            <w:tcW w:type="dxa" w:w="2880"/>
+          </w:tcPr>
+          <w:p>
+            <w:r>
+              <w:t>`1c900d1`</w:t>
+            </w:r>
+          </w:p>
+        </w:tc>
+        <w:tc>
+          <w:tcPr>
+            <w:tcW w:type="dxa" w:w="2880"/>
+          </w:tcPr>
+          <w:p>
+            <w:r>
+              <w:t>Follow-Up 7 (Item 2)</w:t>
+            </w:r>
+          </w:p>
+        </w:tc>
+        <w:tc>
+          <w:tcPr>
+            <w:tcW w:type="dxa" w:w="2880"/>
+          </w:tcPr>
+          <w:p>
+            <w:r>
+              <w:t>ci(deploy): assert specific failure error messages in smoke test negative checks</w:t>
+            </w:r>
+          </w:p>
+        </w:tc>
+      </w:tr>
+      <w:tr>
+        <w:tc>
+          <w:tcPr>
+            <w:tcW w:type="dxa" w:w="2880"/>
+          </w:tcPr>
+          <w:p>
+            <w:r>
+              <w:t>`0e12b6b`</w:t>
+            </w:r>
+          </w:p>
+        </w:tc>
+        <w:tc>
+          <w:tcPr>
+            <w:tcW w:type="dxa" w:w="2880"/>
+          </w:tcPr>
+          <w:p>
+            <w:r>
+              <w:t>Follow-Up 7 (Item 3)</w:t>
+            </w:r>
+          </w:p>
+        </w:tc>
+        <w:tc>
+          <w:tcPr>
+            <w:tcW w:type="dxa" w:w="2880"/>
+          </w:tcPr>
+          <w:p>
+            <w:r>
+              <w:t>ci(deploy): add backend Dockerfile and resources to smoke test path filter</w:t>
+            </w:r>
+          </w:p>
+        </w:tc>
+      </w:tr>
+      <w:tr>
+        <w:tc>
+          <w:tcPr>
+            <w:tcW w:type="dxa" w:w="2880"/>
+          </w:tcPr>
+          <w:p>
+            <w:r>
+              <w:t>`c6133fa`</w:t>
+            </w:r>
+          </w:p>
+        </w:tc>
+        <w:tc>
+          <w:tcPr>
+            <w:tcW w:type="dxa" w:w="2880"/>
+          </w:tcPr>
+          <w:p>
+            <w:r>
+              <w:t>Follow-Up 7 (Item 4)</w:t>
+            </w:r>
+          </w:p>
+        </w:tc>
+        <w:tc>
+          <w:tcPr>
+            <w:tcW w:type="dxa" w:w="2880"/>
+          </w:tcPr>
+          <w:p>
+            <w:r>
+              <w:t>feat(security): add eager JWT validation and TC-DEPLOY-12 compose smoke test check</w:t>
+            </w:r>
+          </w:p>
+        </w:tc>
+      </w:tr>
     </w:tbl>
     <w:p/>
     <w:sectPr>

</xml_diff>

<commit_message>
docs(deploy): document JWT breaking change and cd.yml reviewer dispatch guidance
</commit_message>
<xml_diff>
--- a/docs/audit/ci-cd-deploy-fixes_AI_Audit_Log.docx
+++ b/docs/audit/ci-cd-deploy-fixes_AI_Audit_Log.docx
@@ -189,6 +189,102 @@
       </w:pPr>
       <w:r>
         <w:t>Added `.github/workflows/compose-smoke-test.yml` running in GitHub Actions to test `sqlserver` healthcheck, `db-init` database creation, idempotency, port 1433 isolation, and `IMAGE_TAG` requirement.</w:t>
+      </w:r>
+    </w:p>
+    <w:p>
+      <w:pPr>
+        <w:pStyle w:val="Heading3"/>
+      </w:pPr>
+      <w:r>
+        <w:t>Changed Files Inventory</w:t>
+      </w:r>
+    </w:p>
+    <w:p>
+      <w:pPr>
+        <w:pStyle w:val="ListBullet"/>
+      </w:pPr>
+      <w:r>
+        <w:t>`.github/workflows/compose-smoke-test.yml`</w:t>
+      </w:r>
+    </w:p>
+    <w:p>
+      <w:pPr>
+        <w:pStyle w:val="ListBullet"/>
+      </w:pPr>
+      <w:r>
+        <w:t>`.github/workflows/cd.yml`</w:t>
+      </w:r>
+    </w:p>
+    <w:p>
+      <w:pPr>
+        <w:pStyle w:val="ListBullet"/>
+      </w:pPr>
+      <w:r>
+        <w:t>`.github/workflows/ci.yml`</w:t>
+      </w:r>
+    </w:p>
+    <w:p>
+      <w:pPr>
+        <w:pStyle w:val="ListBullet"/>
+      </w:pPr>
+      <w:r>
+        <w:t>`backend/src/main/java/com/sportify/identity/security/JwtService.java`</w:t>
+      </w:r>
+    </w:p>
+    <w:p>
+      <w:pPr>
+        <w:pStyle w:val="ListBullet"/>
+      </w:pPr>
+      <w:r>
+        <w:t>`backend/src/test/java/com/sportify/identity/security/JwtServiceTest.java`</w:t>
+      </w:r>
+    </w:p>
+    <w:p>
+      <w:pPr>
+        <w:pStyle w:val="ListBullet"/>
+      </w:pPr>
+      <w:r>
+        <w:t>`deploy/compose.yaml`</w:t>
+      </w:r>
+    </w:p>
+    <w:p>
+      <w:pPr>
+        <w:pStyle w:val="ListBullet"/>
+      </w:pPr>
+      <w:r>
+        <w:t>`deploy/.env.example`</w:t>
+      </w:r>
+    </w:p>
+    <w:p>
+      <w:pPr>
+        <w:pStyle w:val="ListBullet"/>
+      </w:pPr>
+      <w:r>
+        <w:t>`docs/ci-cd.md`</w:t>
+      </w:r>
+    </w:p>
+    <w:p>
+      <w:pPr>
+        <w:pStyle w:val="ListBullet"/>
+      </w:pPr>
+      <w:r>
+        <w:t>`docs/tests/ci-cd-deploy-fixes_test_cases.md`</w:t>
+      </w:r>
+    </w:p>
+    <w:p>
+      <w:pPr>
+        <w:pStyle w:val="ListBullet"/>
+      </w:pPr>
+      <w:r>
+        <w:t>`docs/audit/ci-cd-deploy-fixes_AI_Audit_Log.md`</w:t>
+      </w:r>
+    </w:p>
+    <w:p>
+      <w:pPr>
+        <w:pStyle w:val="ListBullet"/>
+      </w:pPr>
+      <w:r>
+        <w:t>`docs/audit/ci-cd-deploy-fixes_AI_Audit_Log.docx`</w:t>
       </w:r>
     </w:p>
     <w:p>
@@ -1106,7 +1202,7 @@
         <w:pStyle w:val="ListBullet"/>
       </w:pPr>
       <w:r>
-        <w:t>Added automated CI check for TC-DEPLOY-12 in `compose-smoke-test.yml`: running the backend container against a healthy database with the unedited placeholder `&lt;REPLACE_WITH_BASE64_SECRET_MIN_32_BYTES&gt;` and asserting startup failure with JWT decoding error.</w:t>
+        <w:t>Added automated CI check for TC-DEPLOY-12 in `compose-smoke-test.yml`: running the backend container against a healthy database with the unedited placeholder `&lt;REPLACE_WITH_BASE64_SECRET_MIN_32_BYTES&gt;` and asserting startup failure.</w:t>
       </w:r>
     </w:p>
     <w:p>
@@ -1115,6 +1211,54 @@
       </w:pPr>
       <w:r>
         <w:t>Documented that TC-DEPLOY-01 and TC-DEPLOY-02 are NOT RUN on PR #36 and provided exact reviewer steps to trigger `cd.yml` via `workflow_dispatch` (with `DEPLOY_ENABLED` unset) before or right after merge.</w:t>
+      </w:r>
+    </w:p>
+    <w:p>
+      <w:pPr>
+        <w:pStyle w:val="ListBullet"/>
+      </w:pPr>
+      <w:r>
+        <w:t>**Follow-Up 8 (Application-Owned JWT Error Message, Breaking Change, and CD Dispatch Guidance)**:</w:t>
+      </w:r>
+    </w:p>
+    <w:p>
+      <w:pPr>
+        <w:pStyle w:val="ListBullet"/>
+      </w:pPr>
+      <w:r>
+        <w:t>Updated `JwtService.validateSecretKey()` to throw `IllegalStateException("JWT_SECRET must be a valid Base64 string that decodes to at least 32 bytes", ex)` wrapping the underlying cause.</w:t>
+      </w:r>
+    </w:p>
+    <w:p>
+      <w:pPr>
+        <w:pStyle w:val="ListBullet"/>
+      </w:pPr>
+      <w:r>
+        <w:t>Extended `JwtServiceTest` to cover 10 comprehensive unit tests: valid secret starting normally, illegal Base64 characters, key shorter than 256 bits, empty secret, blank secret, and null secret.</w:t>
+      </w:r>
+    </w:p>
+    <w:p>
+      <w:pPr>
+        <w:pStyle w:val="ListBullet"/>
+      </w:pPr>
+      <w:r>
+        <w:t>Updated `.github/workflows/compose-smoke-test.yml` step `Assert unedited JWT_SECRET placeholder causes backend startup failure` to assert specifically for the application-owned error message.</w:t>
+      </w:r>
+    </w:p>
+    <w:p>
+      <w:pPr>
+        <w:pStyle w:val="ListBullet"/>
+      </w:pPr>
+      <w:r>
+        <w:t>Documented breaking change: all Spring Boot profiles fail fast at startup if `JWT_SECRET` is invalid or unedited. Developers must provide a valid Base64 string of at least 32 bytes in their `.env` or IDE environment variables.</w:t>
+      </w:r>
+    </w:p>
+    <w:p>
+      <w:pPr>
+        <w:pStyle w:val="ListBullet"/>
+      </w:pPr>
+      <w:r>
+        <w:t>Added CD reviewer dispatch guidance: documented that dispatching `cd.yml` pushes a sha-tagged image to GHCR, and explained how to differentiate between PR-related workflow issues and unrelated upstream Trivy CVE vulnerabilities.</w:t>
       </w:r>
     </w:p>
     <w:p>
@@ -1877,7 +2021,7 @@
           </w:tcPr>
           <w:p>
             <w:r>
-              <w:t>Eager `@PostConstruct` throws `DecodingException`; container exits with code 1.</w:t>
+              <w:t>Eager `@PostConstruct` throws `IllegalStateException`; container exits with code 1.</w:t>
             </w:r>
           </w:p>
         </w:tc>
@@ -2985,6 +3129,134 @@
           </w:p>
         </w:tc>
       </w:tr>
+      <w:tr>
+        <w:tc>
+          <w:tcPr>
+            <w:tcW w:type="dxa" w:w="2880"/>
+          </w:tcPr>
+          <w:p>
+            <w:r>
+              <w:t>`c2bc768`</w:t>
+            </w:r>
+          </w:p>
+        </w:tc>
+        <w:tc>
+          <w:tcPr>
+            <w:tcW w:type="dxa" w:w="2880"/>
+          </w:tcPr>
+          <w:p>
+            <w:r>
+              <w:t>Follow-Up 7 (Item 5)</w:t>
+            </w:r>
+          </w:p>
+        </w:tc>
+        <w:tc>
+          <w:tcPr>
+            <w:tcW w:type="dxa" w:w="2880"/>
+          </w:tcPr>
+          <w:p>
+            <w:r>
+              <w:t>docs(tests): document TC-DEPLOY-01 and TC-DEPLOY-02 reviewer dispatch steps and audit log</w:t>
+            </w:r>
+          </w:p>
+        </w:tc>
+      </w:tr>
+      <w:tr>
+        <w:tc>
+          <w:tcPr>
+            <w:tcW w:type="dxa" w:w="2880"/>
+          </w:tcPr>
+          <w:p>
+            <w:r>
+              <w:t>`4fdfe29`</w:t>
+            </w:r>
+          </w:p>
+        </w:tc>
+        <w:tc>
+          <w:tcPr>
+            <w:tcW w:type="dxa" w:w="2880"/>
+          </w:tcPr>
+          <w:p>
+            <w:r>
+              <w:t>Follow-Up 8 (Item 1-2)</w:t>
+            </w:r>
+          </w:p>
+        </w:tc>
+        <w:tc>
+          <w:tcPr>
+            <w:tcW w:type="dxa" w:w="2880"/>
+          </w:tcPr>
+          <w:p>
+            <w:r>
+              <w:t>feat(security): throw IllegalStateException with descriptive message on invalid JWT secret</w:t>
+            </w:r>
+          </w:p>
+        </w:tc>
+      </w:tr>
+      <w:tr>
+        <w:tc>
+          <w:tcPr>
+            <w:tcW w:type="dxa" w:w="2880"/>
+          </w:tcPr>
+          <w:p>
+            <w:r>
+              <w:t>`a9ddf53`</w:t>
+            </w:r>
+          </w:p>
+        </w:tc>
+        <w:tc>
+          <w:tcPr>
+            <w:tcW w:type="dxa" w:w="2880"/>
+          </w:tcPr>
+          <w:p>
+            <w:r>
+              <w:t>Follow-Up 8 (Item 1)</w:t>
+            </w:r>
+          </w:p>
+        </w:tc>
+        <w:tc>
+          <w:tcPr>
+            <w:tcW w:type="dxa" w:w="2880"/>
+          </w:tcPr>
+          <w:p>
+            <w:r>
+              <w:t>ci(deploy): assert application-owned JWT error message in smoke test</w:t>
+            </w:r>
+          </w:p>
+        </w:tc>
+      </w:tr>
+      <w:tr>
+        <w:tc>
+          <w:tcPr>
+            <w:tcW w:type="dxa" w:w="2880"/>
+          </w:tcPr>
+          <w:p>
+            <w:r>
+              <w:t>Pending</w:t>
+            </w:r>
+          </w:p>
+        </w:tc>
+        <w:tc>
+          <w:tcPr>
+            <w:tcW w:type="dxa" w:w="2880"/>
+          </w:tcPr>
+          <w:p>
+            <w:r>
+              <w:t>Follow-Up 8 (Item 4-5)</w:t>
+            </w:r>
+          </w:p>
+        </w:tc>
+        <w:tc>
+          <w:tcPr>
+            <w:tcW w:type="dxa" w:w="2880"/>
+          </w:tcPr>
+          <w:p>
+            <w:r>
+              <w:t>docs(deploy): document JWT breaking change and cd.yml reviewer dispatch guidance</w:t>
+            </w:r>
+          </w:p>
+        </w:tc>
+      </w:tr>
     </w:tbl>
     <w:p/>
     <w:sectPr>

</xml_diff>